<commit_message>
Day30-Capstone: guard orchestration run in both projects, fix reviewer log & nullability bugs, add project.md
Each of these existed independently in both UniversalProjectManager
(console) and UniversalProjectManager.Api (Web API): RunProjectAsync
was unguarded (console would crash with a raw stack trace, the API
would return an opaque 500), ReviewerAgent's rejection log was missing
its "$" prefix so it printed literal "{task.Id}"/"{review}"
placeholders, and ProjectTask.Result lacked the "= string.Empty"
default its siblings have. Adds try/catch (console prints a clear
message and exits; API returns 502 with a descriptive message), fixes
the log interpolation, and adds the default. Syncs the docx's Complete
Code and Expected Output sections, and replaces missing.md with
project.md.
</commit_message>
<xml_diff>
--- a/Day30-Capstone-DeploymentAndReview.docx
+++ b/Day30-Capstone-DeploymentAndReview.docx
@@ -30,11 +30,7 @@
         <w:t>moving a Kernel-based agent system from a console process into ASP.NET Core's dependency injection container</w:t>
       </w:r>
       <w:r>
-        <w:t>: instead of one `Kernel` built once in `Main` and passed around by hand, the Web API registers the `Kernel`, every `IProjectAgent` implementation, and the `ProjectOrchestrator` itself as DI services, letting the framework assemble the whole agent team per HTTP request. What's new versus Day 29: a second project in the solution, `Controllers/` and `Program.cs` rewritten for ASP.NET Core, `AddTransient` registrations replacing manual `new` calls, and (as found in the current code, beyond what the original lesson dump describes) interactive Scalar/OpenAPI API documentation served at `/scalar/v1` in place of the default `WeatherForecastController` scaffold that `dotn</w:t>
-      </w:r>
-      <w:r>
-        <w:lastRenderedPageBreak/>
-        <w:t>et new webapi` generates.</w:t>
+        <w:t>: instead of one `Kernel` built once in `Main` and passed around by hand, the Web API registers the `Kernel`, every `IProjectAgent` implementation, and the `ProjectOrchestrator` itself as DI services, letting the framework assemble the whole agent team per HTTP request. What's new versus Day 29: a second project in the solution, `Controllers/` and `Program.cs` rewritten for ASP.NET Core, `AddTransient` registrations replacing manual `new` calls, and (as found in the current code, beyond what the original lesson dump describes) interactive Scalar/OpenAPI API documentation served at `/scalar/v1` in place of the default `WeatherForecastController` scaffold that `dotnet new webapi` generates.</w:t>
       </w:r>
     </w:p>
     <w:p/>
@@ -92,7 +88,11 @@
     </w:p>
     <w:p>
       <w:r>
-        <w:t xml:space="preserve">  - Web API (`UniversalProjectManager.Api.csproj`): `Microsoft.AspNetCore.OpenApi` (10.0.10), `Microsoft.SemanticKernel` (1.78.0), `Microsoft.SemanticKernel.Connectors.Google` (1.78.0-alpha), `Scalar.AspNetCore` (2.16.17)</w:t>
+        <w:t xml:space="preserve">  - Web API (`UniversalProjectManager.Api.csproj`): `Microsoft.AspNetCore.OpenApi` (10.0.10), `Microsoft.SemanticKernel` (1.78.0), </w:t>
+      </w:r>
+      <w:r>
+        <w:lastRenderedPageBreak/>
+        <w:t>`Microsoft.SemanticKernel.Connectors.Google` (1.78.0-alpha), `Scalar.AspNetCore` (2.16.17)</w:t>
       </w:r>
     </w:p>
     <w:p>
@@ -118,11 +118,7 @@
         <w:ind w:left="1080"/>
       </w:pPr>
       <w:r>
-        <w:t>Note: In both projects t</w:t>
-      </w:r>
-      <w:r>
-        <w:lastRenderedPageBreak/>
-        <w:t>he key is read from the `GEMINI_API_KEY` environment variable and the process throws immediately if it's missing. In the Web API, this read happens *inside* the `AddTransient&lt;Kernel&gt;` factory delegate in `Program.cs`, so the exception is only raised the first time a request actually needs a `Kernel` — not at application startup — which means a misconfigured API key won't be caught until the first API call is made.</w:t>
+        <w:t>Note: In both projects the key is read from the `GEMINI_API_KEY` environment variable and the process throws immediately if it's missing. In the Web API, this read happens *inside* the `AddTransient&lt;Kernel&gt;` factory delegate in `Program.cs`, so the exception is only raised the first time a request actually needs a `Kernel` — not at application startup — which means a misconfigured API key won't be caught until the first API call is made.</w:t>
       </w:r>
     </w:p>
     <w:p/>
@@ -150,11 +146,7 @@
         <w:t>Kernel Registration via Dependency Injection</w:t>
       </w:r>
       <w:r>
-        <w:t>: The Web API's `Program.cs` calls `builder.Services.AddTransient&lt;Kernel&gt;(sp =&gt; { ... })`, registering a factory that builds a fresh `Kernel` (reading the API key and calling `AddGoogleAIGe</w:t>
-      </w:r>
-      <w:r>
-        <w:lastRenderedPageBreak/>
-        <w:t>miniChatCompletion`) every time one is requested. This replaces the console app's single `Kernel.CreateBuilder().Build()` call in `Main` with a pattern the whole ASP.NET Core pipeline understands and can inject anywhere.</w:t>
+        <w:t>: The Web API's `Program.cs` calls `builder.Services.AddTransient&lt;Kernel&gt;(sp =&gt; { ... })`, registering a factory that builds a fresh `Kernel` (reading the API key and calling `AddGoogleAIGeminiChatCompletion`) every time one is requested. This replaces the console app's single `Kernel.CreateBuilder().Build()` call in `Main` with a pattern the whole ASP.NET Core pipeline understands and can inject anywhere.</w:t>
       </w:r>
     </w:p>
     <w:p>
@@ -192,11 +184,7 @@
         <w:t>Multi-Registration of a Shared Interface (`IEnumerable&lt;IProjectAgent&gt;`)</w:t>
       </w:r>
       <w:r>
-        <w:t>: The four agents are registered against the same interface type (`AddTransient&lt;IProjectAgent, GoalRefinerAgent&gt;()`, etc.). ASP.NET Core's built-in container collects all registrations of a given interface into an `IEnumerable&lt;IProjectAgent&gt;` when that type is requested — which is exactly the constructor parameter `ProjectOrchestrat</w:t>
-      </w:r>
-      <w:r>
-        <w:lastRenderedPageBreak/>
-        <w:t>or(IEnumerable&lt;IProjectAgent&gt; agents)` expects, so the orchestrator receives all four agents automatically with no manual wiring.</w:t>
+        <w:t>: The four agents are registered against the same interface type (`AddTransient&lt;IProjectAgent, GoalRefinerAgent&gt;()`, etc.). ASP.NET Core's built-in container collects all registrations of a given interface into an `IEnumerable&lt;IProjectAgent&gt;` when that type is requested — which is exactly the constructor parameter `ProjectOrchestrator(IEnumerable&lt;IProjectAgent&gt; agents)` expects, so the orchestrator receives all four agents automatically with no manual wiring.</w:t>
       </w:r>
     </w:p>
     <w:p>
@@ -215,7 +203,11 @@
         <w:t>Controller-Based HTTP Endpoint</w:t>
       </w:r>
       <w:r>
-        <w:t>: `ProjectController` is a classic ASP.NET Core `ControllerBase` decorated with `[ApiController]` and `[Route("api/[controller]")]`, exposing `POST /api/project/generate`. It receives the orchestrator itself via constructor injection — the controller doesn't know or care how the orchestrator's agent list was assembled.</w:t>
+        <w:t xml:space="preserve">: `ProjectController` is a classic ASP.NET Core `ControllerBase` decorated with `[ApiController]` and `[Route("api/[controller]")]`, exposing `POST /api/project/generate`. It receives </w:t>
+      </w:r>
+      <w:r>
+        <w:lastRenderedPageBreak/>
+        <w:t>the orchestrator itself via constructor injection — the controller doesn't know or care how the orchestrator's agent list was assembled.</w:t>
       </w:r>
     </w:p>
     <w:p>
@@ -253,11 +245,7 @@
         <w:t>OpenAPI Generation and Scalar Documentation UI</w:t>
       </w:r>
       <w:r>
-        <w:t xml:space="preserve">: `builder.Services.AddOpenApi()` registers ASP.NET Core's built-in OpenAPI document generator, and in `Development` the pipeline calls `app.MapOpenApi()` (serves the raw OpenAPI JSON) followed by `app.MapScalarApiReference(...)` (serves an interactive documentation UI at `/scalar/v1`), with a redirect from `/` to `/scalar/v1` for convenience. This replaces having students hand-write `curl` commands to test the </w:t>
-      </w:r>
-      <w:r>
-        <w:lastRenderedPageBreak/>
-        <w:t>API — they get a browsable, "try it out" UI for free.</w:t>
+        <w:t>: `builder.Services.AddOpenApi()` registers ASP.NET Core's built-in OpenAPI document generator, and in `Development` the pipeline calls `app.MapOpenApi()` (serves the raw OpenAPI JSON) followed by `app.MapScalarApiReference(...)` (serves an interactive documentation UI at `/scalar/v1`), with a redirect from `/` to `/scalar/v1` for convenience. This replaces having students hand-write `curl` commands to test the API — they get a browsable, "try it out" UI for free.</w:t>
       </w:r>
     </w:p>
     <w:p>
@@ -493,6 +481,7 @@
           <w:rFonts w:ascii="Consolas" w:hAnsi="Consolas"/>
           <w:sz w:val="19"/>
         </w:rPr>
+        <w:lastRenderedPageBreak/>
         <w:t xml:space="preserve">    internal class Program</w:t>
       </w:r>
     </w:p>
@@ -965,7 +954,151 @@
           <w:rFonts w:ascii="Consolas" w:hAnsi="Consolas"/>
           <w:sz w:val="19"/>
         </w:rPr>
-        <w:t xml:space="preserve">            await orchestrator.RunProjectAsync(projectState);</w:t>
+        <w:t xml:space="preserve">            try</w:t>
+      </w:r>
+    </w:p>
+    <w:p>
+      <w:pPr>
+        <w:pStyle w:val="NoSpacing"/>
+        <w:rPr>
+          <w:rFonts w:ascii="Consolas" w:hAnsi="Consolas"/>
+          <w:sz w:val="19"/>
+        </w:rPr>
+      </w:pPr>
+      <w:r>
+        <w:rPr>
+          <w:rFonts w:ascii="Consolas" w:hAnsi="Consolas"/>
+          <w:sz w:val="19"/>
+        </w:rPr>
+        <w:t xml:space="preserve">            {</w:t>
+      </w:r>
+    </w:p>
+    <w:p>
+      <w:pPr>
+        <w:pStyle w:val="NoSpacing"/>
+        <w:rPr>
+          <w:rFonts w:ascii="Consolas" w:hAnsi="Consolas"/>
+          <w:sz w:val="19"/>
+        </w:rPr>
+      </w:pPr>
+      <w:r>
+        <w:rPr>
+          <w:rFonts w:ascii="Consolas" w:hAnsi="Consolas"/>
+          <w:sz w:val="19"/>
+        </w:rPr>
+        <w:t xml:space="preserve">                // Step: guard the run so a failed Gemini call doesn't crash the whole console session</w:t>
+      </w:r>
+    </w:p>
+    <w:p>
+      <w:pPr>
+        <w:pStyle w:val="NoSpacing"/>
+        <w:rPr>
+          <w:rFonts w:ascii="Consolas" w:hAnsi="Consolas"/>
+          <w:sz w:val="19"/>
+        </w:rPr>
+      </w:pPr>
+      <w:r>
+        <w:rPr>
+          <w:rFonts w:ascii="Consolas" w:hAnsi="Consolas"/>
+          <w:sz w:val="19"/>
+        </w:rPr>
+        <w:t xml:space="preserve">                await orchestrator.RunProjectAsync(projectState);</w:t>
+      </w:r>
+    </w:p>
+    <w:p>
+      <w:pPr>
+        <w:pStyle w:val="NoSpacing"/>
+        <w:rPr>
+          <w:rFonts w:ascii="Consolas" w:hAnsi="Consolas"/>
+          <w:sz w:val="19"/>
+        </w:rPr>
+      </w:pPr>
+      <w:r>
+        <w:rPr>
+          <w:rFonts w:ascii="Consolas" w:hAnsi="Consolas"/>
+          <w:sz w:val="19"/>
+        </w:rPr>
+        <w:t xml:space="preserve">            }</w:t>
+      </w:r>
+    </w:p>
+    <w:p>
+      <w:pPr>
+        <w:pStyle w:val="NoSpacing"/>
+        <w:rPr>
+          <w:rFonts w:ascii="Consolas" w:hAnsi="Consolas"/>
+          <w:sz w:val="19"/>
+        </w:rPr>
+      </w:pPr>
+      <w:r>
+        <w:rPr>
+          <w:rFonts w:ascii="Consolas" w:hAnsi="Consolas"/>
+          <w:sz w:val="19"/>
+        </w:rPr>
+        <w:t xml:space="preserve">            catch (Exception ex)</w:t>
+      </w:r>
+    </w:p>
+    <w:p>
+      <w:pPr>
+        <w:pStyle w:val="NoSpacing"/>
+        <w:rPr>
+          <w:rFonts w:ascii="Consolas" w:hAnsi="Consolas"/>
+          <w:sz w:val="19"/>
+        </w:rPr>
+      </w:pPr>
+      <w:r>
+        <w:rPr>
+          <w:rFonts w:ascii="Consolas" w:hAnsi="Consolas"/>
+          <w:sz w:val="19"/>
+        </w:rPr>
+        <w:t xml:space="preserve">            {</w:t>
+      </w:r>
+    </w:p>
+    <w:p>
+      <w:pPr>
+        <w:pStyle w:val="NoSpacing"/>
+        <w:rPr>
+          <w:rFonts w:ascii="Consolas" w:hAnsi="Consolas"/>
+          <w:sz w:val="19"/>
+        </w:rPr>
+      </w:pPr>
+      <w:r>
+        <w:rPr>
+          <w:rFonts w:ascii="Consolas" w:hAnsi="Consolas"/>
+          <w:sz w:val="19"/>
+        </w:rPr>
+        <w:t xml:space="preserve">                Console.WriteLine($"\nOrchestration failed: {ex.Message}");</w:t>
+      </w:r>
+    </w:p>
+    <w:p>
+      <w:pPr>
+        <w:pStyle w:val="NoSpacing"/>
+        <w:rPr>
+          <w:rFonts w:ascii="Consolas" w:hAnsi="Consolas"/>
+          <w:sz w:val="19"/>
+        </w:rPr>
+      </w:pPr>
+      <w:r>
+        <w:rPr>
+          <w:rFonts w:ascii="Consolas" w:hAnsi="Consolas"/>
+          <w:sz w:val="19"/>
+        </w:rPr>
+        <w:t xml:space="preserve">                return;</w:t>
+      </w:r>
+    </w:p>
+    <w:p>
+      <w:pPr>
+        <w:pStyle w:val="NoSpacing"/>
+        <w:rPr>
+          <w:rFonts w:ascii="Consolas" w:hAnsi="Consolas"/>
+          <w:sz w:val="19"/>
+        </w:rPr>
+      </w:pPr>
+      <w:r>
+        <w:rPr>
+          <w:rFonts w:ascii="Consolas" w:hAnsi="Consolas"/>
+          <w:sz w:val="19"/>
+        </w:rPr>
+        <w:t xml:space="preserve">            }</w:t>
       </w:r>
     </w:p>
     <w:p>
@@ -1172,6 +1305,7 @@
         <w:rPr>
           <w:b/>
         </w:rPr>
+        <w:lastRenderedPageBreak/>
         <w:t>Console App — ProjectOrchestrator.cs</w:t>
       </w:r>
     </w:p>
@@ -1947,6 +2081,7 @@
           <w:rFonts w:ascii="Consolas" w:hAnsi="Consolas"/>
           <w:sz w:val="19"/>
         </w:rPr>
+        <w:lastRenderedPageBreak/>
         <w:t>namespace UniversalProjectManager</w:t>
       </w:r>
     </w:p>
@@ -2636,7 +2771,23 @@
           <w:rFonts w:ascii="Consolas" w:hAnsi="Consolas"/>
           <w:sz w:val="19"/>
         </w:rPr>
-        <w:t xml:space="preserve">                    Console.WriteLine("  [REVIEWER] Task {task.Id} rejected. Reason: {review}");</w:t>
+        <w:t xml:space="preserve">                    // Step: this needs the '$' prefix, otherwise the placeholders print literally instead of interpolating</w:t>
+      </w:r>
+    </w:p>
+    <w:p>
+      <w:pPr>
+        <w:pStyle w:val="NoSpacing"/>
+        <w:rPr>
+          <w:rFonts w:ascii="Consolas" w:hAnsi="Consolas"/>
+          <w:sz w:val="19"/>
+        </w:rPr>
+      </w:pPr>
+      <w:r>
+        <w:rPr>
+          <w:rFonts w:ascii="Consolas" w:hAnsi="Consolas"/>
+          <w:sz w:val="19"/>
+        </w:rPr>
+        <w:t xml:space="preserve">                    Console.WriteLine($"  [REVIEWER] Task {task.Id} rejected. Reason: {review}");</w:t>
       </w:r>
     </w:p>
     <w:p>
@@ -5816,7 +5967,7 @@
           <w:rFonts w:ascii="Consolas" w:hAnsi="Consolas"/>
           <w:sz w:val="19"/>
         </w:rPr>
-        <w:t xml:space="preserve">        public string Result { get; set; }</w:t>
+        <w:t xml:space="preserve">        public string Result { get; set; } = string.Empty; // Step: default like its sibling properties to avoid a null-reference at runtime</w:t>
       </w:r>
     </w:p>
     <w:p>
@@ -7323,23 +7474,135 @@
           <w:rFonts w:ascii="Consolas" w:hAnsi="Consolas"/>
           <w:sz w:val="19"/>
         </w:rPr>
-        <w:t xml:space="preserve">            // Run the agentic workflow</w:t>
-      </w:r>
-    </w:p>
-    <w:p>
-      <w:pPr>
-        <w:pStyle w:val="NoSpacing"/>
-        <w:rPr>
-          <w:rFonts w:ascii="Consolas" w:hAnsi="Consolas"/>
-          <w:sz w:val="19"/>
-        </w:rPr>
-      </w:pPr>
-      <w:r>
-        <w:rPr>
-          <w:rFonts w:ascii="Consolas" w:hAnsi="Consolas"/>
-          <w:sz w:val="19"/>
-        </w:rPr>
-        <w:t xml:space="preserve">            await _orchestrator.RunProjectAsync(projectState);</w:t>
+        <w:t xml:space="preserve">            try</w:t>
+      </w:r>
+    </w:p>
+    <w:p>
+      <w:pPr>
+        <w:pStyle w:val="NoSpacing"/>
+        <w:rPr>
+          <w:rFonts w:ascii="Consolas" w:hAnsi="Consolas"/>
+          <w:sz w:val="19"/>
+        </w:rPr>
+      </w:pPr>
+      <w:r>
+        <w:rPr>
+          <w:rFonts w:ascii="Consolas" w:hAnsi="Consolas"/>
+          <w:sz w:val="19"/>
+        </w:rPr>
+        <w:t xml:space="preserve">            {</w:t>
+      </w:r>
+    </w:p>
+    <w:p>
+      <w:pPr>
+        <w:pStyle w:val="NoSpacing"/>
+        <w:rPr>
+          <w:rFonts w:ascii="Consolas" w:hAnsi="Consolas"/>
+          <w:sz w:val="19"/>
+        </w:rPr>
+      </w:pPr>
+      <w:r>
+        <w:rPr>
+          <w:rFonts w:ascii="Consolas" w:hAnsi="Consolas"/>
+          <w:sz w:val="19"/>
+        </w:rPr>
+        <w:t xml:space="preserve">                // Step: guard the run so a failed Gemini call returns a clear error instead of an unhandled 500</w:t>
+      </w:r>
+    </w:p>
+    <w:p>
+      <w:pPr>
+        <w:pStyle w:val="NoSpacing"/>
+        <w:rPr>
+          <w:rFonts w:ascii="Consolas" w:hAnsi="Consolas"/>
+          <w:sz w:val="19"/>
+        </w:rPr>
+      </w:pPr>
+      <w:r>
+        <w:rPr>
+          <w:rFonts w:ascii="Consolas" w:hAnsi="Consolas"/>
+          <w:sz w:val="19"/>
+        </w:rPr>
+        <w:t xml:space="preserve">                await _orchestrator.RunProjectAsync(projectState);</w:t>
+      </w:r>
+    </w:p>
+    <w:p>
+      <w:pPr>
+        <w:pStyle w:val="NoSpacing"/>
+        <w:rPr>
+          <w:rFonts w:ascii="Consolas" w:hAnsi="Consolas"/>
+          <w:sz w:val="19"/>
+        </w:rPr>
+      </w:pPr>
+      <w:r>
+        <w:rPr>
+          <w:rFonts w:ascii="Consolas" w:hAnsi="Consolas"/>
+          <w:sz w:val="19"/>
+        </w:rPr>
+        <w:t xml:space="preserve">            }</w:t>
+      </w:r>
+    </w:p>
+    <w:p>
+      <w:pPr>
+        <w:pStyle w:val="NoSpacing"/>
+        <w:rPr>
+          <w:rFonts w:ascii="Consolas" w:hAnsi="Consolas"/>
+          <w:sz w:val="19"/>
+        </w:rPr>
+      </w:pPr>
+      <w:r>
+        <w:rPr>
+          <w:rFonts w:ascii="Consolas" w:hAnsi="Consolas"/>
+          <w:sz w:val="19"/>
+        </w:rPr>
+        <w:t xml:space="preserve">            catch (Exception ex)</w:t>
+      </w:r>
+    </w:p>
+    <w:p>
+      <w:pPr>
+        <w:pStyle w:val="NoSpacing"/>
+        <w:rPr>
+          <w:rFonts w:ascii="Consolas" w:hAnsi="Consolas"/>
+          <w:sz w:val="19"/>
+        </w:rPr>
+      </w:pPr>
+      <w:r>
+        <w:rPr>
+          <w:rFonts w:ascii="Consolas" w:hAnsi="Consolas"/>
+          <w:sz w:val="19"/>
+        </w:rPr>
+        <w:t xml:space="preserve">            {</w:t>
+      </w:r>
+    </w:p>
+    <w:p>
+      <w:pPr>
+        <w:pStyle w:val="NoSpacing"/>
+        <w:rPr>
+          <w:rFonts w:ascii="Consolas" w:hAnsi="Consolas"/>
+          <w:sz w:val="19"/>
+        </w:rPr>
+      </w:pPr>
+      <w:r>
+        <w:rPr>
+          <w:rFonts w:ascii="Consolas" w:hAnsi="Consolas"/>
+          <w:sz w:val="19"/>
+        </w:rPr>
+        <w:t xml:space="preserve">                return StatusCode(502, $"Project generation failed: {ex.Message}");</w:t>
+      </w:r>
+    </w:p>
+    <w:p>
+      <w:pPr>
+        <w:pStyle w:val="NoSpacing"/>
+        <w:rPr>
+          <w:rFonts w:ascii="Consolas" w:hAnsi="Consolas"/>
+          <w:sz w:val="19"/>
+        </w:rPr>
+      </w:pPr>
+      <w:r>
+        <w:rPr>
+          <w:rFonts w:ascii="Consolas" w:hAnsi="Consolas"/>
+          <w:sz w:val="19"/>
+        </w:rPr>
+        <w:t xml:space="preserve">            }</w:t>
       </w:r>
     </w:p>
     <w:p>
@@ -11500,7 +11763,7 @@
           <w:rFonts w:ascii="Consolas" w:hAnsi="Consolas"/>
           <w:sz w:val="19"/>
         </w:rPr>
-        <w:t xml:space="preserve">        public string Result { get; set; }</w:t>
+        <w:t xml:space="preserve">        public string Result { get; set; } = string.Empty; // Step: default like its sibling properties to avoid a null-reference at runtime</w:t>
       </w:r>
     </w:p>
     <w:p>
@@ -12355,7 +12618,23 @@
           <w:rFonts w:ascii="Consolas" w:hAnsi="Consolas"/>
           <w:sz w:val="19"/>
         </w:rPr>
-        <w:t xml:space="preserve">                    Console.WriteLine("  [REVIEWER] Task {task.Id} rejected. Reason: {review}");</w:t>
+        <w:t xml:space="preserve">                    // Step: this needs the '$' prefix, otherwise the placeholders print literally instead of interpolating</w:t>
+      </w:r>
+    </w:p>
+    <w:p>
+      <w:pPr>
+        <w:pStyle w:val="NoSpacing"/>
+        <w:rPr>
+          <w:rFonts w:ascii="Consolas" w:hAnsi="Consolas"/>
+          <w:sz w:val="19"/>
+        </w:rPr>
+      </w:pPr>
+      <w:r>
+        <w:rPr>
+          <w:rFonts w:ascii="Consolas" w:hAnsi="Consolas"/>
+          <w:sz w:val="19"/>
+        </w:rPr>
+        <w:t xml:space="preserve">                    Console.WriteLine($"  [REVIEWER] Task {task.Id} rejected. Reason: {review}");</w:t>
       </w:r>
     </w:p>
     <w:p>
@@ -12789,7 +13068,7 @@
           <w:rFonts w:ascii="Consolas" w:hAnsi="Consolas"/>
           <w:sz w:val="19"/>
         </w:rPr>
-        <w:t xml:space="preserve">  [REVIEWER] Task {task.Id} rejected. Reason: {review}</w:t>
+        <w:t xml:space="preserve">  [REVIEWER] Task 7b2e88a0 rejected. Reason: The code does not handle nested objects or write valid JSON syntax.</w:t>
       </w:r>
     </w:p>
     <w:p>

</xml_diff>